<commit_message>
Updated guide link to releases
</commit_message>
<xml_diff>
--- a/Patient_Transfer_Grading_Support_Tool_Installation_Guide.docx
+++ b/Patient_Transfer_Grading_Support_Tool_Installation_Guide.docx
@@ -19,6 +19,9 @@
     <w:p/>
     <w:p>
       <w:r>
+        <w:rPr>
+          <w:noProof/>
+        </w:rPr>
         <w:drawing>
           <wp:inline distT="0" distB="0" distL="0" distR="0" wp14:anchorId="293671A4" wp14:editId="62BF6F3F">
             <wp:extent cx="5486400" cy="3627120"/>
@@ -71,12 +74,15 @@
       </w:r>
     </w:p>
     <w:p>
-      <w:r>
-        <w:rPr>
-          <w:b/>
-        </w:rPr>
-        <w:t>https://github.com/agsiqueira/patient-transfer-grading-support-tool/releases</w:t>
-      </w:r>
+      <w:hyperlink r:id="rId7" w:history="1">
+        <w:r>
+          <w:rPr>
+            <w:rStyle w:val="Hyperlink"/>
+            <w:b/>
+          </w:rPr>
+          <w:t>https://github.com/agsiqueira/patient-transfer-grading-support-tool/releases</w:t>
+        </w:r>
+      </w:hyperlink>
     </w:p>
     <w:p>
       <w:pPr>
@@ -194,12 +200,28 @@
         <w:pStyle w:val="Heading2"/>
       </w:pPr>
       <w:r>
-        <w:t>3. Obtain a UF NaviGator API Key</w:t>
+        <w:t xml:space="preserve">3. Obtain a UF </w:t>
+      </w:r>
+      <w:proofErr w:type="spellStart"/>
+      <w:r>
+        <w:t>NaviGator</w:t>
+      </w:r>
+      <w:proofErr w:type="spellEnd"/>
+      <w:r>
+        <w:t xml:space="preserve"> API Key</w:t>
       </w:r>
     </w:p>
     <w:p>
       <w:r>
-        <w:t>Go to the UF NaviGator portal:</w:t>
+        <w:t xml:space="preserve">Go to the UF </w:t>
+      </w:r>
+      <w:proofErr w:type="spellStart"/>
+      <w:r>
+        <w:t>NaviGator</w:t>
+      </w:r>
+      <w:proofErr w:type="spellEnd"/>
+      <w:r>
+        <w:t xml:space="preserve"> portal:</w:t>
       </w:r>
     </w:p>
     <w:p>
@@ -357,20 +379,10 @@
           <w:b/>
           <w:bCs/>
         </w:rPr>
-        <w:t>Select the Transcript Folder</w:t>
+        <w:t>Select the Transcript Folder:</w:t>
       </w:r>
       <w:r>
-        <w:rPr>
-          <w:b/>
-          <w:bCs/>
-        </w:rPr>
-        <w:t>:</w:t>
-      </w:r>
-      <w:r>
-        <w:t xml:space="preserve"> This is the folder containing </w:t>
-      </w:r>
-      <w:r>
-        <w:t>students’ transcripts</w:t>
+        <w:t xml:space="preserve"> This is the folder containing students’ transcripts</w:t>
       </w:r>
     </w:p>
     <w:p>
@@ -383,20 +395,10 @@
           <w:bCs/>
         </w:rPr>
         <w:lastRenderedPageBreak/>
-        <w:t>Select the Output Folder</w:t>
+        <w:t>Select the Output Folder:</w:t>
       </w:r>
       <w:r>
-        <w:rPr>
-          <w:b/>
-          <w:bCs/>
-        </w:rPr>
-        <w:t>:</w:t>
-      </w:r>
-      <w:r>
-        <w:t xml:space="preserve"> Define the location of the generated grading </w:t>
-      </w:r>
-      <w:r>
-        <w:t>files</w:t>
+        <w:t xml:space="preserve"> Define the location of the generated grading files</w:t>
       </w:r>
     </w:p>
     <w:p>
@@ -12071,6 +12073,29 @@
       </w:tcPr>
     </w:tblStylePr>
   </w:style>
+  <w:style w:type="character" w:styleId="Hyperlink">
+    <w:name w:val="Hyperlink"/>
+    <w:basedOn w:val="DefaultParagraphFont"/>
+    <w:uiPriority w:val="99"/>
+    <w:unhideWhenUsed/>
+    <w:rsid w:val="00DA70B1"/>
+    <w:rPr>
+      <w:color w:val="0000FF" w:themeColor="hyperlink"/>
+      <w:u w:val="single"/>
+    </w:rPr>
+  </w:style>
+  <w:style w:type="character" w:styleId="UnresolvedMention">
+    <w:name w:val="Unresolved Mention"/>
+    <w:basedOn w:val="DefaultParagraphFont"/>
+    <w:uiPriority w:val="99"/>
+    <w:semiHidden/>
+    <w:unhideWhenUsed/>
+    <w:rsid w:val="00DA70B1"/>
+    <w:rPr>
+      <w:color w:val="605E5C"/>
+      <w:shd w:val="clear" w:color="auto" w:fill="E1DFDD"/>
+    </w:rPr>
+  </w:style>
 </w:styles>
 </file>
 

</xml_diff>